<commit_message>
docs: ronda 4 (prueba con usuarios), enlaces reales de Google Forms/Sheets y pipeline de analitica con CSV real
</commit_message>
<xml_diff>
--- a/Docs/Evidencias/ENLACES_EVIDENCIAS.docx
+++ b/Docs/Evidencias/ENLACES_EVIDENCIAS.docx
@@ -43,19 +43,13 @@
     </w:p>
     <w:p>
       <w:r>
-        <w:rPr>
-          <w:b/>
-          <w:i/>
-          <w:color w:val="555555"/>
-        </w:rPr>
-        <w:t>Importante:</w:t>
+        <w:t xml:space="preserve">Prefijo común: </w:t>
       </w:r>
       <w:r>
         <w:rPr>
-          <w:i/>
-          <w:color w:val="555555"/>
+          <w:rFonts w:ascii="Consolas" w:hAnsi="Consolas"/>
         </w:rPr>
-        <w:t xml:space="preserve"> estos enlaces funcionan una vez que los archivos nuevos estén</w:t>
+        <w:t>https://github.com/Jenifrutica/NitroRhythm_v1/blob/main/</w:t>
       </w:r>
     </w:p>
     <w:p>
@@ -64,22 +58,7 @@
           <w:i/>
           <w:color w:val="555555"/>
         </w:rPr>
-        <w:t>subidos al repositorio (</w:t>
-      </w:r>
-      <w:r>
-        <w:rPr>
-          <w:rFonts w:ascii="Consolas" w:hAnsi="Consolas"/>
-          <w:i/>
-          <w:color w:val="555555"/>
-        </w:rPr>
-        <w:t>git push</w:t>
-      </w:r>
-      <w:r>
-        <w:rPr>
-          <w:i/>
-          <w:color w:val="555555"/>
-        </w:rPr>
-        <w:t>). Hasta entonces, la versión local está en</w:t>
+        <w:t>Las carpetas de entrega (escenas + capturas + informes) están en</w:t>
       </w:r>
     </w:p>
     <w:p>
@@ -89,14 +68,14 @@
           <w:i/>
           <w:color w:val="555555"/>
         </w:rPr>
-        <w:t>SENA/NitroRythm/My project/Docs/</w:t>
+        <w:t>SENA/NitroRythm/Entregas/</w:t>
       </w:r>
       <w:r>
         <w:rPr>
           <w:i/>
           <w:color w:val="555555"/>
         </w:rPr>
-        <w:t>. Cada enlace apunta a un archivo concreto</w:t>
+        <w:t xml:space="preserve"> (formato carpeta; la usuaria genera el ZIP).</w:t>
       </w:r>
     </w:p>
     <w:p>
@@ -105,20 +84,37 @@
           <w:i/>
           <w:color w:val="555555"/>
         </w:rPr>
-        <w:t>para que el instructor lo abra directamente.</w:t>
+        <w:t xml:space="preserve">El enlace del </w:t>
       </w:r>
-    </w:p>
-    <w:p>
       <w:r>
-        <w:t>Prefijo común de los archivos:</w:t>
+        <w:rPr>
+          <w:b/>
+          <w:i/>
+          <w:color w:val="555555"/>
+        </w:rPr>
+        <w:t>formulario de Google</w:t>
       </w:r>
-    </w:p>
-    <w:p>
+      <w:r>
+        <w:rPr>
+          <w:i/>
+          <w:color w:val="555555"/>
+        </w:rPr>
+        <w:t xml:space="preserve"> se pega en </w:t>
+      </w:r>
       <w:r>
         <w:rPr>
           <w:rFonts w:ascii="Consolas" w:hAnsi="Consolas"/>
+          <w:i/>
+          <w:color w:val="555555"/>
         </w:rPr>
-        <w:t>https://github.com/Jenifrutica/NitroRhythm_v1/blob/main/</w:t>
+        <w:t>Docs/Forms_Google/ENLACE_FORMULARIO.txt</w:t>
+      </w:r>
+      <w:r>
+        <w:rPr>
+          <w:i/>
+          <w:color w:val="555555"/>
+        </w:rPr>
+        <w:t>.</w:t>
       </w:r>
     </w:p>
     <w:p/>
@@ -191,9 +187,10 @@
           <w:p>
             <w:r>
               <w:rPr>
+                <w:rFonts w:ascii="Consolas" w:hAnsi="Consolas"/>
                 <w:sz w:val="18"/>
               </w:rPr>
-              <w:t>https://github.com/Jenifrutica/NitroRhythm_v1/blob/main/Docs/Evidencias/GA5-AA1-EV01_Cuestionario.pdf</w:t>
+              <w:t>.../Docs/Evidencias/GA5-AA1-EV01_Cuestionario.pdf</w:t>
             </w:r>
           </w:p>
         </w:tc>
@@ -219,9 +216,10 @@
           <w:p>
             <w:r>
               <w:rPr>
+                <w:rFonts w:ascii="Consolas" w:hAnsi="Consolas"/>
                 <w:sz w:val="18"/>
               </w:rPr>
-              <w:t>https://github.com/Jenifrutica/NitroRhythm_v1/blob/main/Docs/Evidencias/GA5-AA1-EV01_Cuestionario.docx</w:t>
+              <w:t>.../Docs/Evidencias/GA5-AA1-EV01_Cuestionario.docx</w:t>
             </w:r>
           </w:p>
         </w:tc>
@@ -236,7 +234,7 @@
               <w:rPr>
                 <w:sz w:val="18"/>
               </w:rPr>
-              <w:t>Guía para aplicarlo a los 5 usuarios</w:t>
+              <w:t>Guía para los 5 usuarios</w:t>
             </w:r>
           </w:p>
         </w:tc>
@@ -247,9 +245,10 @@
           <w:p>
             <w:r>
               <w:rPr>
+                <w:rFonts w:ascii="Consolas" w:hAnsi="Consolas"/>
                 <w:sz w:val="18"/>
               </w:rPr>
-              <w:t>https://github.com/Jenifrutica/NitroRhythm_v1/blob/main/Docs/Evidencias/Guia_5_Usuarios.pdf</w:t>
+              <w:t>.../Docs/Evidencias/Guia_5_Usuarios.pdf</w:t>
             </w:r>
           </w:p>
         </w:tc>
@@ -264,7 +263,7 @@
               <w:rPr>
                 <w:sz w:val="18"/>
               </w:rPr>
-              <w:t>Reporte de analítica (resumen)</w:t>
+              <w:t>Preguntas listas para Google Forms</w:t>
             </w:r>
           </w:p>
         </w:tc>
@@ -275,9 +274,123 @@
           <w:p>
             <w:r>
               <w:rPr>
+                <w:rFonts w:ascii="Consolas" w:hAnsi="Consolas"/>
                 <w:sz w:val="18"/>
               </w:rPr>
-              <w:t>https://github.com/Jenifrutica/NitroRhythm_v1/tree/main/Docs/Analitica</w:t>
+              <w:t>.../Docs/Forms_Google/PREGUNTAS_FORMULARIO.md</w:t>
+            </w:r>
+          </w:p>
+        </w:tc>
+      </w:tr>
+      <w:tr>
+        <w:tc>
+          <w:tcPr>
+            <w:tcW w:type="dxa" w:w="4320"/>
+          </w:tcPr>
+          <w:p>
+            <w:r>
+              <w:rPr>
+                <w:sz w:val="18"/>
+              </w:rPr>
+              <w:t>Reporte de analítica (estilo Forms)</w:t>
+            </w:r>
+          </w:p>
+        </w:tc>
+        <w:tc>
+          <w:tcPr>
+            <w:tcW w:type="dxa" w:w="4320"/>
+          </w:tcPr>
+          <w:p>
+            <w:r>
+              <w:rPr>
+                <w:rFonts w:ascii="Consolas" w:hAnsi="Consolas"/>
+                <w:sz w:val="18"/>
+              </w:rPr>
+              <w:t>.../Docs/Analitica/reporte_google_forms.md</w:t>
+            </w:r>
+          </w:p>
+        </w:tc>
+      </w:tr>
+      <w:tr>
+        <w:tc>
+          <w:tcPr>
+            <w:tcW w:type="dxa" w:w="4320"/>
+          </w:tcPr>
+          <w:p>
+            <w:r>
+              <w:rPr>
+                <w:sz w:val="18"/>
+              </w:rPr>
+              <w:t>Respuestas (CSV de Forms)</w:t>
+            </w:r>
+          </w:p>
+        </w:tc>
+        <w:tc>
+          <w:tcPr>
+            <w:tcW w:type="dxa" w:w="4320"/>
+          </w:tcPr>
+          <w:p>
+            <w:r>
+              <w:rPr>
+                <w:rFonts w:ascii="Consolas" w:hAnsi="Consolas"/>
+                <w:sz w:val="18"/>
+              </w:rPr>
+              <w:t>.../Docs/Analitica/respuestas.csv</w:t>
+            </w:r>
+          </w:p>
+        </w:tc>
+      </w:tr>
+      <w:tr>
+        <w:tc>
+          <w:tcPr>
+            <w:tcW w:type="dxa" w:w="4320"/>
+          </w:tcPr>
+          <w:p>
+            <w:r>
+              <w:rPr>
+                <w:sz w:val="18"/>
+              </w:rPr>
+              <w:t>Gráficos</w:t>
+            </w:r>
+          </w:p>
+        </w:tc>
+        <w:tc>
+          <w:tcPr>
+            <w:tcW w:type="dxa" w:w="4320"/>
+          </w:tcPr>
+          <w:p>
+            <w:r>
+              <w:rPr>
+                <w:rFonts w:ascii="Consolas" w:hAnsi="Consolas"/>
+                <w:sz w:val="18"/>
+              </w:rPr>
+              <w:t>.../Docs/Analitica/analitica_preguntas.png</w:t>
+            </w:r>
+            <w:r>
+              <w:rPr>
+                <w:sz w:val="18"/>
+              </w:rPr>
+              <w:t xml:space="preserve">, </w:t>
+            </w:r>
+            <w:r>
+              <w:rPr>
+                <w:rFonts w:ascii="Consolas" w:hAnsi="Consolas"/>
+                <w:sz w:val="18"/>
+              </w:rPr>
+              <w:t>analitica_usuarios.png</w:t>
+            </w:r>
+            <w:r>
+              <w:rPr>
+                <w:sz w:val="18"/>
+              </w:rPr>
+              <w:t xml:space="preserve">, </w:t>
+            </w:r>
+            <w:r>
+              <w:rPr>
+                <w:rFonts w:ascii="Consolas" w:hAnsi="Consolas"/>
+                <w:sz w:val="18"/>
+              </w:rPr>
+              <w:t>distribucion_respuestas.png</w:t>
             </w:r>
           </w:p>
         </w:tc>
@@ -305,7 +418,20 @@
               <w:rPr>
                 <w:sz w:val="18"/>
               </w:rPr>
-              <w:t>https://github.com/Jenifrutica/NitroRhythm_v1/releases/tag/v1.0-prototype (versión previa a los ajustes)</w:t>
+              <w:t xml:space="preserve">Release </w:t>
+            </w:r>
+            <w:r>
+              <w:rPr>
+                <w:rFonts w:ascii="Consolas" w:hAnsi="Consolas"/>
+                <w:sz w:val="18"/>
+              </w:rPr>
+              <w:t>v1.3</w:t>
+            </w:r>
+            <w:r>
+              <w:rPr>
+                <w:sz w:val="18"/>
+              </w:rPr>
+              <w:t xml:space="preserve"> (ver abajo)</w:t>
             </w:r>
           </w:p>
         </w:tc>
@@ -331,176 +457,15 @@
           <w:p>
             <w:r>
               <w:rPr>
+                <w:rFonts w:ascii="Consolas" w:hAnsi="Consolas"/>
                 <w:sz w:val="18"/>
               </w:rPr>
-              <w:t>https://github.com/Jenifrutica/NitroRhythm_v1/tree/main/Assets/Scenes</w:t>
+              <w:t>.../tree/main/Assets/Scenes</w:t>
             </w:r>
           </w:p>
         </w:tc>
       </w:tr>
     </w:tbl>
-    <w:p>
-      <w:r>
-        <w:rPr>
-          <w:b/>
-          <w:i/>
-          <w:color w:val="555555"/>
-        </w:rPr>
-        <w:t>Build con los ajustes de la ronda 2:</w:t>
-      </w:r>
-      <w:r>
-        <w:rPr>
-          <w:i/>
-          <w:color w:val="555555"/>
-        </w:rPr>
-        <w:t xml:space="preserve"> </w:t>
-      </w:r>
-      <w:r>
-        <w:rPr>
-          <w:rFonts w:ascii="Consolas" w:hAnsi="Consolas"/>
-          <w:i/>
-          <w:color w:val="555555"/>
-        </w:rPr>
-        <w:t>SENA/NitroRythm/Builds/NitroRhythm_WebGL_v1.2.zip</w:t>
-      </w:r>
-      <w:r>
-        <w:rPr>
-          <w:i/>
-          <w:color w:val="555555"/>
-        </w:rPr>
-        <w:t xml:space="preserve"> (31 MB, web)</w:t>
-      </w:r>
-    </w:p>
-    <w:p>
-      <w:r>
-        <w:rPr>
-          <w:i/>
-          <w:color w:val="555555"/>
-        </w:rPr>
-        <w:t xml:space="preserve">y </w:t>
-      </w:r>
-      <w:r>
-        <w:rPr>
-          <w:rFonts w:ascii="Consolas" w:hAnsi="Consolas"/>
-          <w:i/>
-          <w:color w:val="555555"/>
-        </w:rPr>
-        <w:t>SENA/NitroRythm/Builds/NitroRhythm_Linux_v1.2.zip</w:t>
-      </w:r>
-      <w:r>
-        <w:rPr>
-          <w:i/>
-          <w:color w:val="555555"/>
-        </w:rPr>
-        <w:t xml:space="preserve"> (escritorio).</w:t>
-      </w:r>
-    </w:p>
-    <w:p>
-      <w:r>
-        <w:rPr>
-          <w:i/>
-          <w:color w:val="555555"/>
-        </w:rPr>
-        <w:t xml:space="preserve">El Release </w:t>
-      </w:r>
-      <w:r>
-        <w:rPr>
-          <w:rFonts w:ascii="Consolas" w:hAnsi="Consolas"/>
-          <w:i/>
-          <w:color w:val="555555"/>
-        </w:rPr>
-        <w:t>v1.0-prototype</w:t>
-      </w:r>
-      <w:r>
-        <w:rPr>
-          <w:i/>
-          <w:color w:val="555555"/>
-        </w:rPr>
-        <w:t xml:space="preserve"> aún tiene la build anterior; para que los 5 usuarios</w:t>
-      </w:r>
-    </w:p>
-    <w:p>
-      <w:r>
-        <w:rPr>
-          <w:i/>
-          <w:color w:val="555555"/>
-        </w:rPr>
-        <w:t xml:space="preserve">prueben la versión ajustada, sube el zip web como release </w:t>
-      </w:r>
-      <w:r>
-        <w:rPr>
-          <w:rFonts w:ascii="Consolas" w:hAnsi="Consolas"/>
-          <w:i/>
-          <w:color w:val="555555"/>
-        </w:rPr>
-        <w:t>v1.2</w:t>
-      </w:r>
-      <w:r>
-        <w:rPr>
-          <w:i/>
-          <w:color w:val="555555"/>
-        </w:rPr>
-        <w:t xml:space="preserve"> (o a itch.io).</w:t>
-      </w:r>
-    </w:p>
-    <w:p>
-      <w:r>
-        <w:rPr>
-          <w:b/>
-          <w:i/>
-          <w:color w:val="555555"/>
-        </w:rPr>
-        <w:t>Pendiente tuyo:</w:t>
-      </w:r>
-      <w:r>
-        <w:rPr>
-          <w:i/>
-          <w:color w:val="555555"/>
-        </w:rPr>
-        <w:t xml:space="preserve"> el enlace del </w:t>
-      </w:r>
-      <w:r>
-        <w:rPr>
-          <w:b/>
-          <w:i/>
-          <w:color w:val="555555"/>
-        </w:rPr>
-        <w:t>formulario de Google Forms</w:t>
-      </w:r>
-      <w:r>
-        <w:rPr>
-          <w:i/>
-          <w:color w:val="555555"/>
-        </w:rPr>
-        <w:t xml:space="preserve"> (la guía lo</w:t>
-      </w:r>
-    </w:p>
-    <w:p>
-      <w:r>
-        <w:rPr>
-          <w:i/>
-          <w:color w:val="555555"/>
-        </w:rPr>
-        <w:t>pide) y las respuestas de los 5 usuarios (2 reales faltan en</w:t>
-      </w:r>
-    </w:p>
-    <w:p>
-      <w:r>
-        <w:rPr>
-          <w:rFonts w:ascii="Consolas" w:hAnsi="Consolas"/>
-          <w:i/>
-          <w:color w:val="555555"/>
-        </w:rPr>
-        <w:t>Docs/Analitica/respuestas.csv</w:t>
-      </w:r>
-      <w:r>
-        <w:rPr>
-          <w:i/>
-          <w:color w:val="555555"/>
-        </w:rPr>
-        <w:t>).</w:t>
-      </w:r>
-    </w:p>
     <w:p>
       <w:pPr>
         <w:pStyle w:val="Heading2"/>
@@ -559,7 +524,20 @@
               <w:rPr>
                 <w:sz w:val="18"/>
               </w:rPr>
-              <w:t>Informe (PDF)</w:t>
+              <w:t xml:space="preserve">Informe (PDF, </w:t>
+            </w:r>
+            <w:r>
+              <w:rPr>
+                <w:b/>
+                <w:sz w:val="18"/>
+              </w:rPr>
+              <w:t>con gráficos incrustados</w:t>
+            </w:r>
+            <w:r>
+              <w:rPr>
+                <w:sz w:val="18"/>
+              </w:rPr>
+              <w:t>)</w:t>
             </w:r>
           </w:p>
         </w:tc>
@@ -570,9 +548,10 @@
           <w:p>
             <w:r>
               <w:rPr>
+                <w:rFonts w:ascii="Consolas" w:hAnsi="Consolas"/>
                 <w:sz w:val="18"/>
               </w:rPr>
-              <w:t>https://github.com/Jenifrutica/NitroRhythm_v1/blob/main/Docs/Evidencias/GA5-AA2-EV01_Informe_Hallazgos.pdf</w:t>
+              <w:t>.../Docs/Evidencias/GA5-AA2-EV01_Informe_Hallazgos.pdf</w:t>
             </w:r>
           </w:p>
         </w:tc>
@@ -598,9 +577,10 @@
           <w:p>
             <w:r>
               <w:rPr>
+                <w:rFonts w:ascii="Consolas" w:hAnsi="Consolas"/>
                 <w:sz w:val="18"/>
               </w:rPr>
-              <w:t>https://github.com/Jenifrutica/NitroRhythm_v1/blob/main/Docs/Evidencias/GA5-AA2-EV01_Informe_Hallazgos.docx</w:t>
+              <w:t>.../Docs/Evidencias/GA5-AA2-EV01_Informe_Hallazgos.docx</w:t>
             </w:r>
           </w:p>
         </w:tc>
@@ -615,7 +595,7 @@
               <w:rPr>
                 <w:sz w:val="18"/>
               </w:rPr>
-              <w:t>Gráfico por pregunta</w:t>
+              <w:t>Anexo de analítica</w:t>
             </w:r>
           </w:p>
         </w:tc>
@@ -626,65 +606,10 @@
           <w:p>
             <w:r>
               <w:rPr>
+                <w:rFonts w:ascii="Consolas" w:hAnsi="Consolas"/>
                 <w:sz w:val="18"/>
               </w:rPr>
-              <w:t>https://github.com/Jenifrutica/NitroRhythm_v1/blob/main/Docs/Analitica/analitica_preguntas.png</w:t>
-            </w:r>
-          </w:p>
-        </w:tc>
-      </w:tr>
-      <w:tr>
-        <w:tc>
-          <w:tcPr>
-            <w:tcW w:type="dxa" w:w="4320"/>
-          </w:tcPr>
-          <w:p>
-            <w:r>
-              <w:rPr>
-                <w:sz w:val="18"/>
-              </w:rPr>
-              <w:t>Gráfico por usuario</w:t>
-            </w:r>
-          </w:p>
-        </w:tc>
-        <w:tc>
-          <w:tcPr>
-            <w:tcW w:type="dxa" w:w="4320"/>
-          </w:tcPr>
-          <w:p>
-            <w:r>
-              <w:rPr>
-                <w:sz w:val="18"/>
-              </w:rPr>
-              <w:t>https://github.com/Jenifrutica/NitroRhythm_v1/blob/main/Docs/Analitica/analitica_usuarios.png</w:t>
-            </w:r>
-          </w:p>
-        </w:tc>
-      </w:tr>
-      <w:tr>
-        <w:tc>
-          <w:tcPr>
-            <w:tcW w:type="dxa" w:w="4320"/>
-          </w:tcPr>
-          <w:p>
-            <w:r>
-              <w:rPr>
-                <w:sz w:val="18"/>
-              </w:rPr>
-              <w:t>Datos (CSV)</w:t>
-            </w:r>
-          </w:p>
-        </w:tc>
-        <w:tc>
-          <w:tcPr>
-            <w:tcW w:type="dxa" w:w="4320"/>
-          </w:tcPr>
-          <w:p>
-            <w:r>
-              <w:rPr>
-                <w:sz w:val="18"/>
-              </w:rPr>
-              <w:t>https://github.com/Jenifrutica/NitroRhythm_v1/blob/main/Docs/Analitica/respuestas.csv</w:t>
+              <w:t>.../Docs/Analitica/</w:t>
             </w:r>
           </w:p>
         </w:tc>
@@ -748,7 +673,7 @@
               <w:rPr>
                 <w:sz w:val="18"/>
               </w:rPr>
-              <w:t>Registro ordenado de cambios (PDF)</w:t>
+              <w:t>Registro de cambios (ronda 1)</w:t>
             </w:r>
           </w:p>
         </w:tc>
@@ -759,9 +684,10 @@
           <w:p>
             <w:r>
               <w:rPr>
+                <w:rFonts w:ascii="Consolas" w:hAnsi="Consolas"/>
                 <w:sz w:val="18"/>
               </w:rPr>
-              <w:t>https://github.com/Jenifrutica/NitroRhythm_v1/blob/main/Docs/Evidencias/GA5-AA3-EV01_Registro_Cambios.pdf</w:t>
+              <w:t>.../Docs/Evidencias/GA5-AA3-EV01_Registro_Cambios.pdf</w:t>
             </w:r>
           </w:p>
         </w:tc>
@@ -776,7 +702,7 @@
               <w:rPr>
                 <w:sz w:val="18"/>
               </w:rPr>
-              <w:t>Registro de cambios (Markdown con imágenes)</w:t>
+              <w:t>Registro de cambios (ronda 2)</w:t>
             </w:r>
           </w:p>
         </w:tc>
@@ -787,79 +713,10 @@
           <w:p>
             <w:r>
               <w:rPr>
+                <w:rFonts w:ascii="Consolas" w:hAnsi="Consolas"/>
                 <w:sz w:val="18"/>
               </w:rPr>
-              <w:t>https://github.com/Jenifrutica/NitroRhythm_v1/blob/main/Docs/Evidencias/GA5-AA3-EV01_Registro_Cambios.md</w:t>
-            </w:r>
-          </w:p>
-        </w:tc>
-      </w:tr>
-      <w:tr>
-        <w:tc>
-          <w:tcPr>
-            <w:tcW w:type="dxa" w:w="4320"/>
-          </w:tcPr>
-          <w:p>
-            <w:r>
-              <w:rPr>
-                <w:b/>
-                <w:sz w:val="18"/>
-              </w:rPr>
-              <w:t>Ronda 2</w:t>
-            </w:r>
-            <w:r>
-              <w:rPr>
-                <w:sz w:val="18"/>
-              </w:rPr>
-              <w:t xml:space="preserve"> — registro de ajustes (PDF)</w:t>
-            </w:r>
-          </w:p>
-        </w:tc>
-        <w:tc>
-          <w:tcPr>
-            <w:tcW w:type="dxa" w:w="4320"/>
-          </w:tcPr>
-          <w:p>
-            <w:r>
-              <w:rPr>
-                <w:sz w:val="18"/>
-              </w:rPr>
-              <w:t>https://github.com/Jenifrutica/NitroRhythm_v1/blob/main/Docs/Evidencias/GA5-AA3-EV01_Registro_Cambios_Ronda2.pdf</w:t>
-            </w:r>
-          </w:p>
-        </w:tc>
-      </w:tr>
-      <w:tr>
-        <w:tc>
-          <w:tcPr>
-            <w:tcW w:type="dxa" w:w="4320"/>
-          </w:tcPr>
-          <w:p>
-            <w:r>
-              <w:rPr>
-                <w:b/>
-                <w:sz w:val="18"/>
-              </w:rPr>
-              <w:t>Ronda 2</w:t>
-            </w:r>
-            <w:r>
-              <w:rPr>
-                <w:sz w:val="18"/>
-              </w:rPr>
-              <w:t xml:space="preserve"> — registro de ajustes (Markdown con imágenes)</w:t>
-            </w:r>
-          </w:p>
-        </w:tc>
-        <w:tc>
-          <w:tcPr>
-            <w:tcW w:type="dxa" w:w="4320"/>
-          </w:tcPr>
-          <w:p>
-            <w:r>
-              <w:rPr>
-                <w:sz w:val="18"/>
-              </w:rPr>
-              <w:t>https://github.com/Jenifrutica/NitroRhythm_v1/blob/main/Docs/Evidencias/GA5-AA3-EV01_Registro_Cambios_Ronda2.md</w:t>
+              <w:t>.../Docs/Evidencias/GA5-AA3-EV01_Registro_Cambios_Ronda2.pdf</w:t>
             </w:r>
           </w:p>
         </w:tc>
@@ -874,7 +731,7 @@
               <w:rPr>
                 <w:sz w:val="18"/>
               </w:rPr>
-              <w:t>Créditos y licencias de los assets libres</w:t>
+              <w:t>Registro de cambios (ronda 3)</w:t>
             </w:r>
           </w:p>
         </w:tc>
@@ -885,9 +742,10 @@
           <w:p>
             <w:r>
               <w:rPr>
+                <w:rFonts w:ascii="Consolas" w:hAnsi="Consolas"/>
                 <w:sz w:val="18"/>
               </w:rPr>
-              <w:t>https://github.com/Jenifrutica/NitroRhythm_v1/blob/main/Docs/CREDITOS_Y_LICENCIAS.md</w:t>
+              <w:t>.../Docs/Evidencias/GA5-AA3-EV01_Registro_Cambios_Ronda3.pdf</w:t>
             </w:r>
           </w:p>
         </w:tc>
@@ -902,7 +760,7 @@
               <w:rPr>
                 <w:sz w:val="18"/>
               </w:rPr>
-              <w:t>Resultado de las pruebas automáticas</w:t>
+              <w:t>Justificación de controles</w:t>
             </w:r>
           </w:p>
         </w:tc>
@@ -913,9 +771,10 @@
           <w:p>
             <w:r>
               <w:rPr>
+                <w:rFonts w:ascii="Consolas" w:hAnsi="Consolas"/>
                 <w:sz w:val="18"/>
               </w:rPr>
-              <w:t>https://github.com/Jenifrutica/NitroRhythm_v1/blob/main/Docs/Evidencias/RESULTADO_PRUEBAS.md</w:t>
+              <w:t>.../Docs/Evidencias/GA5-AA3-EV01_Justificacion_Controles.pdf</w:t>
             </w:r>
           </w:p>
         </w:tc>
@@ -930,14 +789,7 @@
               <w:rPr>
                 <w:sz w:val="18"/>
               </w:rPr>
-              <w:t xml:space="preserve">Escena </w:t>
-            </w:r>
-            <w:r>
-              <w:rPr>
-                <w:rFonts w:ascii="Consolas" w:hAnsi="Consolas"/>
-                <w:sz w:val="18"/>
-              </w:rPr>
-              <w:t>00_MainMenu</w:t>
+              <w:t>Resultado de pruebas (40 en verde)</w:t>
             </w:r>
           </w:p>
         </w:tc>
@@ -948,9 +800,10 @@
           <w:p>
             <w:r>
               <w:rPr>
+                <w:rFonts w:ascii="Consolas" w:hAnsi="Consolas"/>
                 <w:sz w:val="18"/>
               </w:rPr>
-              <w:t>https://github.com/Jenifrutica/NitroRhythm_v1/blob/main/Assets/Scenes/00_MainMenu.unity</w:t>
+              <w:t>.../Docs/Evidencias/RESULTADO_PRUEBAS.pdf</w:t>
             </w:r>
           </w:p>
         </w:tc>
@@ -965,14 +818,7 @@
               <w:rPr>
                 <w:sz w:val="18"/>
               </w:rPr>
-              <w:t xml:space="preserve">Escena </w:t>
-            </w:r>
-            <w:r>
-              <w:rPr>
-                <w:rFonts w:ascii="Consolas" w:hAnsi="Consolas"/>
-                <w:sz w:val="18"/>
-              </w:rPr>
-              <w:t>01_CharacterSelect</w:t>
+              <w:t>Escenas (4)</w:t>
             </w:r>
           </w:p>
         </w:tc>
@@ -983,9 +829,23 @@
           <w:p>
             <w:r>
               <w:rPr>
+                <w:rFonts w:ascii="Consolas" w:hAnsi="Consolas"/>
                 <w:sz w:val="18"/>
               </w:rPr>
-              <w:t>https://github.com/Jenifrutica/NitroRhythm_v1/blob/main/Assets/Scenes/01_CharacterSelect.unity</w:t>
+              <w:t>.../Assets/Scenes/00_MainMenu.unity</w:t>
+            </w:r>
+            <w:r>
+              <w:rPr>
+                <w:sz w:val="18"/>
+              </w:rPr>
+              <w:t xml:space="preserve"> … </w:t>
+            </w:r>
+            <w:r>
+              <w:rPr>
+                <w:rFonts w:ascii="Consolas" w:hAnsi="Consolas"/>
+                <w:sz w:val="18"/>
+              </w:rPr>
+              <w:t>03_Results.unity</w:t>
             </w:r>
           </w:p>
         </w:tc>
@@ -1000,77 +860,7 @@
               <w:rPr>
                 <w:sz w:val="18"/>
               </w:rPr>
-              <w:t xml:space="preserve">Escena </w:t>
-            </w:r>
-            <w:r>
-              <w:rPr>
-                <w:rFonts w:ascii="Consolas" w:hAnsi="Consolas"/>
-                <w:sz w:val="18"/>
-              </w:rPr>
-              <w:t>02_Gameplay</w:t>
-            </w:r>
-          </w:p>
-        </w:tc>
-        <w:tc>
-          <w:tcPr>
-            <w:tcW w:type="dxa" w:w="4320"/>
-          </w:tcPr>
-          <w:p>
-            <w:r>
-              <w:rPr>
-                <w:sz w:val="18"/>
-              </w:rPr>
-              <w:t>https://github.com/Jenifrutica/NitroRhythm_v1/blob/main/Assets/Scenes/02_Gameplay.unity</w:t>
-            </w:r>
-          </w:p>
-        </w:tc>
-      </w:tr>
-      <w:tr>
-        <w:tc>
-          <w:tcPr>
-            <w:tcW w:type="dxa" w:w="4320"/>
-          </w:tcPr>
-          <w:p>
-            <w:r>
-              <w:rPr>
-                <w:sz w:val="18"/>
-              </w:rPr>
-              <w:t xml:space="preserve">Escena </w:t>
-            </w:r>
-            <w:r>
-              <w:rPr>
-                <w:rFonts w:ascii="Consolas" w:hAnsi="Consolas"/>
-                <w:sz w:val="18"/>
-              </w:rPr>
-              <w:t>03_Results</w:t>
-            </w:r>
-          </w:p>
-        </w:tc>
-        <w:tc>
-          <w:tcPr>
-            <w:tcW w:type="dxa" w:w="4320"/>
-          </w:tcPr>
-          <w:p>
-            <w:r>
-              <w:rPr>
-                <w:sz w:val="18"/>
-              </w:rPr>
-              <w:t>https://github.com/Jenifrutica/NitroRhythm_v1/blob/main/Assets/Scenes/03_Results.unity</w:t>
-            </w:r>
-          </w:p>
-        </w:tc>
-      </w:tr>
-      <w:tr>
-        <w:tc>
-          <w:tcPr>
-            <w:tcW w:type="dxa" w:w="4320"/>
-          </w:tcPr>
-          <w:p>
-            <w:r>
-              <w:rPr>
-                <w:sz w:val="18"/>
-              </w:rPr>
-              <w:t xml:space="preserve">Carpeta de capturas </w:t>
+              <w:t xml:space="preserve">Capturas </w:t>
             </w:r>
             <w:r>
               <w:rPr>
@@ -1088,9 +878,10 @@
           <w:p>
             <w:r>
               <w:rPr>
+                <w:rFonts w:ascii="Consolas" w:hAnsi="Consolas"/>
                 <w:sz w:val="18"/>
               </w:rPr>
-              <w:t>https://github.com/Jenifrutica/NitroRhythm_v1/tree/main/Docs/Capturas/Antes</w:t>
+              <w:t>.../tree/main/Docs/Capturas/Antes</w:t>
             </w:r>
           </w:p>
         </w:tc>
@@ -1105,7 +896,7 @@
               <w:rPr>
                 <w:sz w:val="18"/>
               </w:rPr>
-              <w:t xml:space="preserve">Carpeta de capturas </w:t>
+              <w:t xml:space="preserve">Capturas </w:t>
             </w:r>
             <w:r>
               <w:rPr>
@@ -1123,43 +914,18 @@
           <w:p>
             <w:r>
               <w:rPr>
+                <w:rFonts w:ascii="Consolas" w:hAnsi="Consolas"/>
                 <w:sz w:val="18"/>
               </w:rPr>
-              <w:t>https://github.com/Jenifrutica/NitroRhythm_v1/tree/main/Docs/Capturas/Despues</w:t>
+              <w:t>.../tree/main/Docs/Capturas/Despues</w:t>
             </w:r>
           </w:p>
         </w:tc>
       </w:tr>
-    </w:tbl>
-    <w:p>
-      <w:r>
-        <w:t xml:space="preserve">Capturas de la </w:t>
-      </w:r>
-      <w:r>
-        <w:rPr>
-          <w:b/>
-        </w:rPr>
-        <w:t>ronda 2</w:t>
-      </w:r>
-      <w:r>
-        <w:t xml:space="preserve"> (antes → después):</w:t>
-      </w:r>
-    </w:p>
-    <w:tbl>
-      <w:tblPr>
-        <w:tblStyle w:val="LightGrid-Accent1"/>
-        <w:tblW w:type="auto" w:w="0"/>
-        <w:tblLook w:firstColumn="1" w:firstRow="1" w:lastColumn="0" w:lastRow="0" w:noHBand="0" w:noVBand="1" w:val="04A0"/>
-      </w:tblPr>
-      <w:tblGrid>
-        <w:gridCol w:w="2880"/>
-        <w:gridCol w:w="2880"/>
-        <w:gridCol w:w="2880"/>
-      </w:tblGrid>
       <w:tr>
         <w:tc>
           <w:tcPr>
-            <w:tcW w:type="dxa" w:w="2880"/>
+            <w:tcW w:type="dxa" w:w="4320"/>
           </w:tcPr>
           <w:p>
             <w:r>
@@ -1167,668 +933,32 @@
                 <w:b/>
                 <w:sz w:val="18"/>
               </w:rPr>
-              <w:t>Aspecto</w:t>
+              <w:t>Carpeta de entrega</w:t>
+            </w:r>
+            <w:r>
+              <w:rPr>
+                <w:sz w:val="18"/>
+              </w:rPr>
+              <w:t xml:space="preserve"> (escenas + capturas + informes)</w:t>
             </w:r>
           </w:p>
         </w:tc>
         <w:tc>
           <w:tcPr>
-            <w:tcW w:type="dxa" w:w="2880"/>
+            <w:tcW w:type="dxa" w:w="4320"/>
           </w:tcPr>
           <w:p>
             <w:r>
               <w:rPr>
-                <w:b/>
+                <w:rFonts w:ascii="Consolas" w:hAnsi="Consolas"/>
                 <w:sz w:val="18"/>
               </w:rPr>
-              <w:t>Antes</w:t>
-            </w:r>
-          </w:p>
-        </w:tc>
-        <w:tc>
-          <w:tcPr>
-            <w:tcW w:type="dxa" w:w="2880"/>
-          </w:tcPr>
-          <w:p>
-            <w:r>
-              <w:rPr>
-                <w:b/>
-                <w:sz w:val="18"/>
-              </w:rPr>
-              <w:t>Después</w:t>
-            </w:r>
-          </w:p>
-        </w:tc>
-      </w:tr>
-      <w:tr>
-        <w:tc>
-          <w:tcPr>
-            <w:tcW w:type="dxa" w:w="2880"/>
-          </w:tcPr>
-          <w:p>
-            <w:r>
-              <w:rPr>
-                <w:sz w:val="18"/>
-              </w:rPr>
-              <w:t>Selección de personajes</w:t>
-            </w:r>
-          </w:p>
-        </w:tc>
-        <w:tc>
-          <w:tcPr>
-            <w:tcW w:type="dxa" w:w="2880"/>
-          </w:tcPr>
-          <w:p>
-            <w:r>
-              <w:rPr>
-                <w:sz w:val="18"/>
-              </w:rPr>
-              <w:t>https://github.com/Jenifrutica/NitroRhythm_v1/blob/main/Docs/Capturas/Antes/ronda2/seleccion_al_reves_reporte.png</w:t>
-            </w:r>
-          </w:p>
-        </w:tc>
-        <w:tc>
-          <w:tcPr>
-            <w:tcW w:type="dxa" w:w="2880"/>
-          </w:tcPr>
-          <w:p>
-            <w:r>
-              <w:rPr>
-                <w:sz w:val="18"/>
-              </w:rPr>
-              <w:t>https://github.com/Jenifrutica/NitroRhythm_v1/blob/main/Docs/Capturas/Despues/ronda2/ui/ui_seleccion.png</w:t>
-            </w:r>
-          </w:p>
-        </w:tc>
-      </w:tr>
-      <w:tr>
-        <w:tc>
-          <w:tcPr>
-            <w:tcW w:type="dxa" w:w="2880"/>
-          </w:tcPr>
-          <w:p>
-            <w:r>
-              <w:rPr>
-                <w:sz w:val="18"/>
-              </w:rPr>
-              <w:t>HUD</w:t>
-            </w:r>
-          </w:p>
-        </w:tc>
-        <w:tc>
-          <w:tcPr>
-            <w:tcW w:type="dxa" w:w="2880"/>
-          </w:tcPr>
-          <w:p>
-            <w:r>
-              <w:rPr>
-                <w:sz w:val="18"/>
-              </w:rPr>
-              <w:t>https://github.com/Jenifrutica/NitroRhythm_v1/blob/main/Docs/Capturas/Antes/ronda2/hud_basico_y_bot_cubo.png</w:t>
-            </w:r>
-          </w:p>
-        </w:tc>
-        <w:tc>
-          <w:tcPr>
-            <w:tcW w:type="dxa" w:w="2880"/>
-          </w:tcPr>
-          <w:p>
-            <w:r>
-              <w:rPr>
-                <w:sz w:val="18"/>
-              </w:rPr>
-              <w:t>https://github.com/Jenifrutica/NitroRhythm_v1/blob/main/Docs/Capturas/Despues/ronda2/ui/ui_hud_dominio5.png</w:t>
-            </w:r>
-          </w:p>
-        </w:tc>
-      </w:tr>
-      <w:tr>
-        <w:tc>
-          <w:tcPr>
-            <w:tcW w:type="dxa" w:w="2880"/>
-          </w:tcPr>
-          <w:p>
-            <w:r>
-              <w:rPr>
-                <w:sz w:val="18"/>
-              </w:rPr>
-              <w:t>Niveles</w:t>
-            </w:r>
-          </w:p>
-        </w:tc>
-        <w:tc>
-          <w:tcPr>
-            <w:tcW w:type="dxa" w:w="2880"/>
-          </w:tcPr>
-          <w:p>
-            <w:r>
-              <w:rPr>
-                <w:sz w:val="18"/>
-              </w:rPr>
-              <w:t>https://github.com/Jenifrutica/NitroRhythm_v1/blob/main/Docs/Capturas/Antes/ronda2/gameplay_cubos_y_un_solo_estilo.png</w:t>
-            </w:r>
-          </w:p>
-        </w:tc>
-        <w:tc>
-          <w:tcPr>
-            <w:tcW w:type="dxa" w:w="2880"/>
-          </w:tcPr>
-          <w:p>
-            <w:r>
-              <w:rPr>
-                <w:sz w:val="18"/>
-              </w:rPr>
-              <w:t>https://github.com/Jenifrutica/NitroRhythm_v1/blob/main/Docs/Capturas/Despues/ronda2/RESUMEN_dominios.png</w:t>
-            </w:r>
-          </w:p>
-        </w:tc>
-      </w:tr>
-      <w:tr>
-        <w:tc>
-          <w:tcPr>
-            <w:tcW w:type="dxa" w:w="2880"/>
-          </w:tcPr>
-          <w:p>
-            <w:r>
-              <w:rPr>
-                <w:sz w:val="18"/>
-              </w:rPr>
-              <w:t>Menú principal</w:t>
-            </w:r>
-          </w:p>
-        </w:tc>
-        <w:tc>
-          <w:tcPr>
-            <w:tcW w:type="dxa" w:w="2880"/>
-          </w:tcPr>
-          <w:p>
-            <w:r>
-              <w:rPr>
-                <w:sz w:val="18"/>
-              </w:rPr>
-              <w:t>—</w:t>
-            </w:r>
-          </w:p>
-        </w:tc>
-        <w:tc>
-          <w:tcPr>
-            <w:tcW w:type="dxa" w:w="2880"/>
-          </w:tcPr>
-          <w:p>
-            <w:r>
-              <w:rPr>
-                <w:sz w:val="18"/>
-              </w:rPr>
-              <w:t>https://github.com/Jenifrutica/NitroRhythm_v1/blob/main/Docs/Capturas/Despues/ronda2/ui/ui_menu_principal.png</w:t>
-            </w:r>
-          </w:p>
-        </w:tc>
-      </w:tr>
-      <w:tr>
-        <w:tc>
-          <w:tcPr>
-            <w:tcW w:type="dxa" w:w="2880"/>
-          </w:tcPr>
-          <w:p>
-            <w:r>
-              <w:rPr>
-                <w:sz w:val="18"/>
-              </w:rPr>
-              <w:t>Resultados con rango</w:t>
-            </w:r>
-          </w:p>
-        </w:tc>
-        <w:tc>
-          <w:tcPr>
-            <w:tcW w:type="dxa" w:w="2880"/>
-          </w:tcPr>
-          <w:p>
-            <w:r>
-              <w:rPr>
-                <w:sz w:val="18"/>
-              </w:rPr>
-              <w:t>—</w:t>
-            </w:r>
-          </w:p>
-        </w:tc>
-        <w:tc>
-          <w:tcPr>
-            <w:tcW w:type="dxa" w:w="2880"/>
-          </w:tcPr>
-          <w:p>
-            <w:r>
-              <w:rPr>
-                <w:sz w:val="18"/>
-              </w:rPr>
-              <w:t>https://github.com/Jenifrutica/NitroRhythm_v1/blob/main/Docs/Capturas/Despues/ronda2/ui/ui_resultados.png</w:t>
-            </w:r>
-          </w:p>
-        </w:tc>
-      </w:tr>
-      <w:tr>
-        <w:tc>
-          <w:tcPr>
-            <w:tcW w:type="dxa" w:w="2880"/>
-          </w:tcPr>
-          <w:p>
-            <w:r>
-              <w:rPr>
-                <w:sz w:val="18"/>
-              </w:rPr>
-              <w:t>Ataque del villano</w:t>
-            </w:r>
-          </w:p>
-        </w:tc>
-        <w:tc>
-          <w:tcPr>
-            <w:tcW w:type="dxa" w:w="2880"/>
-          </w:tcPr>
-          <w:p>
-            <w:r>
-              <w:rPr>
-                <w:sz w:val="18"/>
-              </w:rPr>
-              <w:t>—</w:t>
-            </w:r>
-          </w:p>
-        </w:tc>
-        <w:tc>
-          <w:tcPr>
-            <w:tcW w:type="dxa" w:w="2880"/>
-          </w:tcPr>
-          <w:p>
-            <w:r>
-              <w:rPr>
-                <w:sz w:val="18"/>
-              </w:rPr>
-              <w:t>https://github.com/Jenifrutica/NitroRhythm_v1/blob/main/Docs/Capturas/Despues/ronda2/villano/villano_ataque.png</w:t>
-            </w:r>
-          </w:p>
-        </w:tc>
-      </w:tr>
-      <w:tr>
-        <w:tc>
-          <w:tcPr>
-            <w:tcW w:type="dxa" w:w="2880"/>
-          </w:tcPr>
-          <w:p>
-            <w:r>
-              <w:rPr>
-                <w:sz w:val="18"/>
-              </w:rPr>
-              <w:t>Carpeta de dominios</w:t>
-            </w:r>
-          </w:p>
-        </w:tc>
-        <w:tc>
-          <w:tcPr>
-            <w:tcW w:type="dxa" w:w="2880"/>
-          </w:tcPr>
-          <w:p>
-            <w:r>
-              <w:rPr>
-                <w:sz w:val="18"/>
-              </w:rPr>
-              <w:t>—</w:t>
-            </w:r>
-          </w:p>
-        </w:tc>
-        <w:tc>
-          <w:tcPr>
-            <w:tcW w:type="dxa" w:w="2880"/>
-          </w:tcPr>
-          <w:p>
-            <w:r>
-              <w:rPr>
-                <w:sz w:val="18"/>
-              </w:rPr>
-              <w:t>https://github.com/Jenifrutica/NitroRhythm_v1/tree/main/Docs/Capturas/Despues/ronda2/dominios</w:t>
+              <w:t>SENA/NitroRythm/Entregas/GA5-AA3-EV01/</w:t>
             </w:r>
           </w:p>
         </w:tc>
       </w:tr>
     </w:tbl>
-    <w:p>
-      <w:r>
-        <w:t>Capturas de la ronda 1:</w:t>
-      </w:r>
-    </w:p>
-    <w:tbl>
-      <w:tblPr>
-        <w:tblStyle w:val="LightGrid-Accent1"/>
-        <w:tblW w:type="auto" w:w="0"/>
-        <w:tblLook w:firstColumn="1" w:firstRow="1" w:lastColumn="0" w:lastRow="0" w:noHBand="0" w:noVBand="1" w:val="04A0"/>
-      </w:tblPr>
-      <w:tblGrid>
-        <w:gridCol w:w="2880"/>
-        <w:gridCol w:w="2880"/>
-        <w:gridCol w:w="2880"/>
-      </w:tblGrid>
-      <w:tr>
-        <w:tc>
-          <w:tcPr>
-            <w:tcW w:type="dxa" w:w="2880"/>
-          </w:tcPr>
-          <w:p>
-            <w:r>
-              <w:rPr>
-                <w:b/>
-                <w:sz w:val="18"/>
-              </w:rPr>
-              <w:t>Aspecto</w:t>
-            </w:r>
-          </w:p>
-        </w:tc>
-        <w:tc>
-          <w:tcPr>
-            <w:tcW w:type="dxa" w:w="2880"/>
-          </w:tcPr>
-          <w:p>
-            <w:r>
-              <w:rPr>
-                <w:b/>
-                <w:sz w:val="18"/>
-              </w:rPr>
-              <w:t>Antes</w:t>
-            </w:r>
-          </w:p>
-        </w:tc>
-        <w:tc>
-          <w:tcPr>
-            <w:tcW w:type="dxa" w:w="2880"/>
-          </w:tcPr>
-          <w:p>
-            <w:r>
-              <w:rPr>
-                <w:b/>
-                <w:sz w:val="18"/>
-              </w:rPr>
-              <w:t>Después</w:t>
-            </w:r>
-          </w:p>
-        </w:tc>
-      </w:tr>
-      <w:tr>
-        <w:tc>
-          <w:tcPr>
-            <w:tcW w:type="dxa" w:w="2880"/>
-          </w:tcPr>
-          <w:p>
-            <w:r>
-              <w:rPr>
-                <w:sz w:val="18"/>
-              </w:rPr>
-              <w:t>HUD de gameplay</w:t>
-            </w:r>
-          </w:p>
-        </w:tc>
-        <w:tc>
-          <w:tcPr>
-            <w:tcW w:type="dxa" w:w="2880"/>
-          </w:tcPr>
-          <w:p>
-            <w:r>
-              <w:rPr>
-                <w:sz w:val="18"/>
-              </w:rPr>
-              <w:t>https://github.com/Jenifrutica/NitroRhythm_v1/blob/main/Docs/Capturas/Antes/03_Gameplay_HUD_original.png</w:t>
-            </w:r>
-          </w:p>
-        </w:tc>
-        <w:tc>
-          <w:tcPr>
-            <w:tcW w:type="dxa" w:w="2880"/>
-          </w:tcPr>
-          <w:p>
-            <w:r>
-              <w:rPr>
-                <w:sz w:val="18"/>
-              </w:rPr>
-              <w:t>https://github.com/Jenifrutica/NitroRhythm_v1/blob/main/Docs/Capturas/Despues/gameplay/gameplay_impacto_checkpoint_turbo.png</w:t>
-            </w:r>
-          </w:p>
-        </w:tc>
-      </w:tr>
-      <w:tr>
-        <w:tc>
-          <w:tcPr>
-            <w:tcW w:type="dxa" w:w="2880"/>
-          </w:tcPr>
-          <w:p>
-            <w:r>
-              <w:rPr>
-                <w:sz w:val="18"/>
-              </w:rPr>
-              <w:t>Selección de personajes</w:t>
-            </w:r>
-          </w:p>
-        </w:tc>
-        <w:tc>
-          <w:tcPr>
-            <w:tcW w:type="dxa" w:w="2880"/>
-          </w:tcPr>
-          <w:p>
-            <w:r>
-              <w:rPr>
-                <w:sz w:val="18"/>
-              </w:rPr>
-              <w:t>https://github.com/Jenifrutica/NitroRhythm_v1/blob/main/Docs/Capturas/Antes/02_CharacterSelect_original.png</w:t>
-            </w:r>
-          </w:p>
-        </w:tc>
-        <w:tc>
-          <w:tcPr>
-            <w:tcW w:type="dxa" w:w="2880"/>
-          </w:tcPr>
-          <w:p>
-            <w:r>
-              <w:rPr>
-                <w:sz w:val="18"/>
-              </w:rPr>
-              <w:t>https://github.com/Jenifrutica/NitroRhythm_v1/blob/main/Docs/Capturas/Despues/gameplay/seleccion_personajes.png</w:t>
-            </w:r>
-          </w:p>
-        </w:tc>
-      </w:tr>
-      <w:tr>
-        <w:tc>
-          <w:tcPr>
-            <w:tcW w:type="dxa" w:w="2880"/>
-          </w:tcPr>
-          <w:p>
-            <w:r>
-              <w:rPr>
-                <w:sz w:val="18"/>
-              </w:rPr>
-              <w:t>Piloto de Lyra</w:t>
-            </w:r>
-          </w:p>
-        </w:tc>
-        <w:tc>
-          <w:tcPr>
-            <w:tcW w:type="dxa" w:w="2880"/>
-          </w:tcPr>
-          <w:p>
-            <w:r>
-              <w:rPr>
-                <w:sz w:val="18"/>
-              </w:rPr>
-              <w:t>https://github.com/Jenifrutica/NitroRhythm_v1/blob/main/Docs/Capturas/Antes/piloto/lyra_lado.png</w:t>
-            </w:r>
-          </w:p>
-        </w:tc>
-        <w:tc>
-          <w:tcPr>
-            <w:tcW w:type="dxa" w:w="2880"/>
-          </w:tcPr>
-          <w:p>
-            <w:r>
-              <w:rPr>
-                <w:sz w:val="18"/>
-              </w:rPr>
-              <w:t>https://github.com/Jenifrutica/NitroRhythm_v1/blob/main/Docs/Capturas/Despues/piloto/lyra_kart_lado.png</w:t>
-            </w:r>
-          </w:p>
-        </w:tc>
-      </w:tr>
-      <w:tr>
-        <w:tc>
-          <w:tcPr>
-            <w:tcW w:type="dxa" w:w="2880"/>
-          </w:tcPr>
-          <w:p>
-            <w:r>
-              <w:rPr>
-                <w:sz w:val="18"/>
-              </w:rPr>
-              <w:t>Piloto de Karel</w:t>
-            </w:r>
-          </w:p>
-        </w:tc>
-        <w:tc>
-          <w:tcPr>
-            <w:tcW w:type="dxa" w:w="2880"/>
-          </w:tcPr>
-          <w:p>
-            <w:r>
-              <w:rPr>
-                <w:sz w:val="18"/>
-              </w:rPr>
-              <w:t>https://github.com/Jenifrutica/NitroRhythm_v1/blob/main/Docs/Capturas/Antes/piloto/karel_lado.png</w:t>
-            </w:r>
-          </w:p>
-        </w:tc>
-        <w:tc>
-          <w:tcPr>
-            <w:tcW w:type="dxa" w:w="2880"/>
-          </w:tcPr>
-          <w:p>
-            <w:r>
-              <w:rPr>
-                <w:sz w:val="18"/>
-              </w:rPr>
-              <w:t>https://github.com/Jenifrutica/NitroRhythm_v1/blob/main/Docs/Capturas/Despues/piloto/karel_kart_lado.png</w:t>
-            </w:r>
-          </w:p>
-        </w:tc>
-      </w:tr>
-      <w:tr>
-        <w:tc>
-          <w:tcPr>
-            <w:tcW w:type="dxa" w:w="2880"/>
-          </w:tcPr>
-          <w:p>
-            <w:r>
-              <w:rPr>
-                <w:sz w:val="18"/>
-              </w:rPr>
-              <w:t>Pista y checkpoints</w:t>
-            </w:r>
-          </w:p>
-        </w:tc>
-        <w:tc>
-          <w:tcPr>
-            <w:tcW w:type="dxa" w:w="2880"/>
-          </w:tcPr>
-          <w:p>
-            <w:r>
-              <w:rPr>
-                <w:sz w:val="18"/>
-              </w:rPr>
-              <w:t>—</w:t>
-            </w:r>
-          </w:p>
-        </w:tc>
-        <w:tc>
-          <w:tcPr>
-            <w:tcW w:type="dxa" w:w="2880"/>
-          </w:tcPr>
-          <w:p>
-            <w:r>
-              <w:rPr>
-                <w:sz w:val="18"/>
-              </w:rPr>
-              <w:t>https://github.com/Jenifrutica/NitroRhythm_v1/blob/main/Docs/Capturas/Despues/gameplay/gameplay_conduciendo.png</w:t>
-            </w:r>
-          </w:p>
-        </w:tc>
-      </w:tr>
-      <w:tr>
-        <w:tc>
-          <w:tcPr>
-            <w:tcW w:type="dxa" w:w="2880"/>
-          </w:tcPr>
-          <w:p>
-            <w:r>
-              <w:rPr>
-                <w:sz w:val="18"/>
-              </w:rPr>
-              <w:t>Resultados</w:t>
-            </w:r>
-          </w:p>
-        </w:tc>
-        <w:tc>
-          <w:tcPr>
-            <w:tcW w:type="dxa" w:w="2880"/>
-          </w:tcPr>
-          <w:p>
-            <w:r>
-              <w:rPr>
-                <w:sz w:val="18"/>
-              </w:rPr>
-              <w:t>—</w:t>
-            </w:r>
-          </w:p>
-        </w:tc>
-        <w:tc>
-          <w:tcPr>
-            <w:tcW w:type="dxa" w:w="2880"/>
-          </w:tcPr>
-          <w:p>
-            <w:r>
-              <w:rPr>
-                <w:sz w:val="18"/>
-              </w:rPr>
-              <w:t>https://github.com/Jenifrutica/NitroRhythm_v1/blob/main/Docs/Capturas/Despues/gameplay/resultados_con_tiempo.png</w:t>
-            </w:r>
-          </w:p>
-        </w:tc>
-      </w:tr>
-    </w:tbl>
-    <w:p>
-      <w:r>
-        <w:rPr>
-          <w:b/>
-          <w:i/>
-          <w:color w:val="555555"/>
-        </w:rPr>
-        <w:t>Paquete listo para enviar tal cual:</w:t>
-      </w:r>
-      <w:r>
-        <w:rPr>
-          <w:i/>
-          <w:color w:val="555555"/>
-        </w:rPr>
-        <w:t xml:space="preserve"> </w:t>
-      </w:r>
-      <w:r>
-        <w:rPr>
-          <w:rFonts w:ascii="Consolas" w:hAnsi="Consolas"/>
-          <w:i/>
-          <w:color w:val="555555"/>
-        </w:rPr>
-        <w:t>SENA/NitroRythm/Entregas/GA5-AA3-EV01_NitroRhythm.zip</w:t>
-      </w:r>
-    </w:p>
-    <w:p>
-      <w:r>
-        <w:rPr>
-          <w:i/>
-          <w:color w:val="555555"/>
-        </w:rPr>
-        <w:t>(las 4 escenas Unity + capturas antes/después + registro de cambios en PDF).</w:t>
-      </w:r>
-    </w:p>
     <w:p>
       <w:pPr>
         <w:pStyle w:val="Heading2"/>
@@ -1885,9 +1015,10 @@
           <w:p>
             <w:r>
               <w:rPr>
+                <w:b/>
                 <w:sz w:val="18"/>
               </w:rPr>
-              <w:t>Contenido de la infografía (PDF)</w:t>
+              <w:t>Infografía (PPTX para importar en Canva)</w:t>
             </w:r>
           </w:p>
         </w:tc>
@@ -1898,9 +1029,10 @@
           <w:p>
             <w:r>
               <w:rPr>
+                <w:rFonts w:ascii="Consolas" w:hAnsi="Consolas"/>
                 <w:sz w:val="18"/>
               </w:rPr>
-              <w:t>https://github.com/Jenifrutica/NitroRhythm_v1/blob/main/Docs/Evidencias/GA5-AA4-EV01_Infografia_Comparativa.pdf</w:t>
+              <w:t>.../Docs/Evidencias/GA5-AA4-EV01_Infografia.pptx</w:t>
             </w:r>
           </w:p>
         </w:tc>
@@ -1915,7 +1047,7 @@
               <w:rPr>
                 <w:sz w:val="18"/>
               </w:rPr>
-              <w:t>Contenido (Markdown con imágenes)</w:t>
+              <w:t>Infografía (PDF)</w:t>
             </w:r>
           </w:p>
         </w:tc>
@@ -1926,9 +1058,69 @@
           <w:p>
             <w:r>
               <w:rPr>
+                <w:rFonts w:ascii="Consolas" w:hAnsi="Consolas"/>
                 <w:sz w:val="18"/>
               </w:rPr>
-              <w:t>https://github.com/Jenifrutica/NitroRhythm_v1/blob/main/Docs/Evidencias/GA5-AA4-EV01_Infografia_Comparativa.md</w:t>
+              <w:t>.../Docs/Evidencias/GA5-AA4-EV01_Infografia.pdf</w:t>
+            </w:r>
+          </w:p>
+        </w:tc>
+      </w:tr>
+      <w:tr>
+        <w:tc>
+          <w:tcPr>
+            <w:tcW w:type="dxa" w:w="4320"/>
+          </w:tcPr>
+          <w:p>
+            <w:r>
+              <w:rPr>
+                <w:sz w:val="18"/>
+              </w:rPr>
+              <w:t>Contenido comparativo (PDF)</w:t>
+            </w:r>
+          </w:p>
+        </w:tc>
+        <w:tc>
+          <w:tcPr>
+            <w:tcW w:type="dxa" w:w="4320"/>
+          </w:tcPr>
+          <w:p>
+            <w:r>
+              <w:rPr>
+                <w:rFonts w:ascii="Consolas" w:hAnsi="Consolas"/>
+                <w:sz w:val="18"/>
+              </w:rPr>
+              <w:t>.../Docs/Evidencias/GA5-AA4-EV01_Infografia_Comparativa.pdf</w:t>
+            </w:r>
+          </w:p>
+        </w:tc>
+      </w:tr>
+      <w:tr>
+        <w:tc>
+          <w:tcPr>
+            <w:tcW w:type="dxa" w:w="4320"/>
+          </w:tcPr>
+          <w:p>
+            <w:r>
+              <w:rPr>
+                <w:b/>
+                <w:sz w:val="18"/>
+              </w:rPr>
+              <w:t>Carpeta de entrega</w:t>
+            </w:r>
+          </w:p>
+        </w:tc>
+        <w:tc>
+          <w:tcPr>
+            <w:tcW w:type="dxa" w:w="4320"/>
+          </w:tcPr>
+          <w:p>
+            <w:r>
+              <w:rPr>
+                <w:rFonts w:ascii="Consolas" w:hAnsi="Consolas"/>
+                <w:sz w:val="18"/>
+              </w:rPr>
+              <w:t>SENA/NitroRythm/Entregas/GA5-AA4-EV01/</w:t>
             </w:r>
           </w:p>
         </w:tc>
@@ -1937,18 +1129,27 @@
     <w:p>
       <w:r>
         <w:rPr>
-          <w:b/>
           <w:i/>
           <w:color w:val="555555"/>
         </w:rPr>
-        <w:t>Pendiente tuyo:</w:t>
+        <w:t>Para cumplir "presentar con plantilla gratuita y compartir enlace": suba el</w:t>
+      </w:r>
+    </w:p>
+    <w:p>
+      <w:r>
+        <w:rPr>
+          <w:rFonts w:ascii="Consolas" w:hAnsi="Consolas"/>
+          <w:i/>
+          <w:color w:val="555555"/>
+        </w:rPr>
+        <w:t>.pptx</w:t>
       </w:r>
       <w:r>
         <w:rPr>
           <w:i/>
           <w:color w:val="555555"/>
         </w:rPr>
-        <w:t xml:space="preserve"> montarla en </w:t>
+        <w:t xml:space="preserve"> a </w:t>
       </w:r>
       <w:r>
         <w:rPr>
@@ -1963,33 +1164,37 @@
           <w:i/>
           <w:color w:val="555555"/>
         </w:rPr>
-        <w:t xml:space="preserve"> con una plantilla gratuita (el contenido</w:t>
+        <w:t xml:space="preserve"> (Crear diseño → Importar PPTX), exporte y comparta el enlace.</w:t>
       </w:r>
     </w:p>
     <w:p>
+      <w:pPr>
+        <w:pStyle w:val="Heading2"/>
+      </w:pPr>
       <w:r>
-        <w:rPr>
-          <w:i/>
-          <w:color w:val="555555"/>
-        </w:rPr>
-        <w:t>y la lista exacta de imágenes ya están en el documento de arriba), exportar el</w:t>
+        <w:t>Build jugable (Release)</w:t>
       </w:r>
     </w:p>
     <w:p>
+      <w:pPr>
+        <w:pStyle w:val="ListBullet"/>
+      </w:pPr>
       <w:r>
         <w:rPr>
           <w:b/>
-          <w:i/>
-          <w:color w:val="555555"/>
         </w:rPr>
-        <w:t>PDF</w:t>
+        <w:t>v1.3 (actual):</w:t>
       </w:r>
       <w:r>
-        <w:rPr>
-          <w:i/>
-          <w:color w:val="555555"/>
-        </w:rPr>
-        <w:t xml:space="preserve"> y pegar aquí el enlace de Canva.</w:t>
+        <w:t xml:space="preserve"> build WebGL verificada en navegador.</w:t>
+      </w:r>
+    </w:p>
+    <w:p>
+      <w:pPr>
+        <w:pStyle w:val="ListBullet"/>
+      </w:pPr>
+      <w:r>
+        <w:t>v1.0-prototype: versión inicial (referencia "antes").</w:t>
       </w:r>
     </w:p>
     <w:p>
@@ -2061,9 +1266,10 @@
           <w:p>
             <w:r>
               <w:rPr>
+                <w:rFonts w:ascii="Consolas" w:hAnsi="Consolas"/>
                 <w:sz w:val="18"/>
               </w:rPr>
-              <w:t>https://github.com/Jenifrutica/NitroRhythm_v1/blob/main/Docs/Evidencias/GA5_EVIDENCIAS_Y_JUSTIFICACION.pdf</w:t>
+              <w:t>.../Docs/Evidencias/GA5_EVIDENCIAS_Y_JUSTIFICACION.pdf</w:t>
             </w:r>
           </w:p>
         </w:tc>
@@ -2089,9 +1295,39 @@
           <w:p>
             <w:r>
               <w:rPr>
+                <w:rFonts w:ascii="Consolas" w:hAnsi="Consolas"/>
                 <w:sz w:val="18"/>
               </w:rPr>
-              <w:t>https://github.com/Jenifrutica/NitroRhythm_v1/blob/main/Docs/Evidencias/PLAN_EJECUCION.pdf</w:t>
+              <w:t>.../Docs/Evidencias/PLAN_EJECUCION.pdf</w:t>
+            </w:r>
+          </w:p>
+        </w:tc>
+      </w:tr>
+      <w:tr>
+        <w:tc>
+          <w:tcPr>
+            <w:tcW w:type="dxa" w:w="4320"/>
+          </w:tcPr>
+          <w:p>
+            <w:r>
+              <w:rPr>
+                <w:sz w:val="18"/>
+              </w:rPr>
+              <w:t>Créditos y licencias</w:t>
+            </w:r>
+          </w:p>
+        </w:tc>
+        <w:tc>
+          <w:tcPr>
+            <w:tcW w:type="dxa" w:w="4320"/>
+          </w:tcPr>
+          <w:p>
+            <w:r>
+              <w:rPr>
+                <w:rFonts w:ascii="Consolas" w:hAnsi="Consolas"/>
+                <w:sz w:val="18"/>
+              </w:rPr>
+              <w:t>.../Docs/CREDITOS_Y_LICENCIAS.md</w:t>
             </w:r>
           </w:p>
         </w:tc>
@@ -2117,37 +1353,10 @@
           <w:p>
             <w:r>
               <w:rPr>
+                <w:rFonts w:ascii="Consolas" w:hAnsi="Consolas"/>
                 <w:sz w:val="18"/>
               </w:rPr>
-              <w:t>https://github.com/Jenifrutica/NitroRhythm_v1/blob/main/README.md</w:t>
-            </w:r>
-          </w:p>
-        </w:tc>
-      </w:tr>
-      <w:tr>
-        <w:tc>
-          <w:tcPr>
-            <w:tcW w:type="dxa" w:w="4320"/>
-          </w:tcPr>
-          <w:p>
-            <w:r>
-              <w:rPr>
-                <w:sz w:val="18"/>
-              </w:rPr>
-              <w:t>Paquete de referencia para Hunyuan3D</w:t>
-            </w:r>
-          </w:p>
-        </w:tc>
-        <w:tc>
-          <w:tcPr>
-            <w:tcW w:type="dxa" w:w="4320"/>
-          </w:tcPr>
-          <w:p>
-            <w:r>
-              <w:rPr>
-                <w:sz w:val="18"/>
-              </w:rPr>
-              <w:t>https://github.com/Jenifrutica/NitroRhythm_v1/blob/main/Docs/Hunyuan/PROMPTS_HUNYUAN.md</w:t>
+              <w:t>.../README.md</w:t>
             </w:r>
           </w:p>
         </w:tc>

</xml_diff>

<commit_message>
docs: analitica con el CSV real de Google Forms (5 respuestas) e informe AA2 regenerado
</commit_message>
<xml_diff>
--- a/Docs/Evidencias/ENLACES_EVIDENCIAS.docx
+++ b/Docs/Evidencias/ENLACES_EVIDENCIAS.docx
@@ -220,6 +220,64 @@
                 <w:sz w:val="18"/>
               </w:rPr>
               <w:t>.../Docs/Evidencias/GA5-AA1-EV01_Cuestionario.docx</w:t>
+            </w:r>
+          </w:p>
+        </w:tc>
+      </w:tr>
+      <w:tr>
+        <w:tc>
+          <w:tcPr>
+            <w:tcW w:type="dxa" w:w="4320"/>
+          </w:tcPr>
+          <w:p>
+            <w:r>
+              <w:rPr>
+                <w:b/>
+                <w:sz w:val="18"/>
+              </w:rPr>
+              <w:t>Formulario en Google Forms</w:t>
+            </w:r>
+          </w:p>
+        </w:tc>
+        <w:tc>
+          <w:tcPr>
+            <w:tcW w:type="dxa" w:w="4320"/>
+          </w:tcPr>
+          <w:p>
+            <w:r>
+              <w:rPr>
+                <w:sz w:val="18"/>
+              </w:rPr>
+              <w:t>https://docs.google.com/forms/d/e/1FAIpQLSeePkpwiZbBUEjVSZMQqB_Svr0BzVuGsiC_B5i-UrjwJA_rYg/viewform</w:t>
+            </w:r>
+          </w:p>
+        </w:tc>
+      </w:tr>
+      <w:tr>
+        <w:tc>
+          <w:tcPr>
+            <w:tcW w:type="dxa" w:w="4320"/>
+          </w:tcPr>
+          <w:p>
+            <w:r>
+              <w:rPr>
+                <w:b/>
+                <w:sz w:val="18"/>
+              </w:rPr>
+              <w:t>Hoja de respuestas</w:t>
+            </w:r>
+          </w:p>
+        </w:tc>
+        <w:tc>
+          <w:tcPr>
+            <w:tcW w:type="dxa" w:w="4320"/>
+          </w:tcPr>
+          <w:p>
+            <w:r>
+              <w:rPr>
+                <w:sz w:val="18"/>
+              </w:rPr>
+              <w:t>https://docs.google.com/spreadsheets/d/1Z-BRPvt6kR823RYpHda_g-1CGeblpPiVRACWpRiF83M/edit</w:t>
             </w:r>
           </w:p>
         </w:tc>
@@ -746,6 +804,35 @@
                 <w:sz w:val="18"/>
               </w:rPr>
               <w:t>.../Docs/Evidencias/GA5-AA3-EV01_Registro_Cambios_Ronda3.pdf</w:t>
+            </w:r>
+          </w:p>
+        </w:tc>
+      </w:tr>
+      <w:tr>
+        <w:tc>
+          <w:tcPr>
+            <w:tcW w:type="dxa" w:w="4320"/>
+          </w:tcPr>
+          <w:p>
+            <w:r>
+              <w:rPr>
+                <w:sz w:val="18"/>
+              </w:rPr>
+              <w:t>Registro de cambios (ronda 4 — prueba con usuarios)</w:t>
+            </w:r>
+          </w:p>
+        </w:tc>
+        <w:tc>
+          <w:tcPr>
+            <w:tcW w:type="dxa" w:w="4320"/>
+          </w:tcPr>
+          <w:p>
+            <w:r>
+              <w:rPr>
+                <w:rFonts w:ascii="Consolas" w:hAnsi="Consolas"/>
+                <w:sz w:val="18"/>
+              </w:rPr>
+              <w:t>.../Docs/Evidencias/GA5-AA3-EV01_Registro_Cambios_Ronda4.pdf</w:t>
             </w:r>
           </w:p>
         </w:tc>

</xml_diff>

<commit_message>
docs: enlace de Canva de la infografia AA4 y README de entregas por evidencia
</commit_message>
<xml_diff>
--- a/Docs/Evidencias/ENLACES_EVIDENCIAS.docx
+++ b/Docs/Evidencias/ENLACES_EVIDENCIAS.docx
@@ -1054,6 +1054,22 @@
         <w:t>AA4-EV01 — Infografía comparativa</w:t>
       </w:r>
     </w:p>
+    <w:p>
+      <w:r>
+        <w:rPr>
+          <w:b/>
+        </w:rPr>
+        <w:t>Enlace de Canva (para compartir):</w:t>
+      </w:r>
+      <w:r>
+        <w:t xml:space="preserve"> https://canva.link/j1aecdvqxvhjluh</w:t>
+      </w:r>
+    </w:p>
+    <w:p>
+      <w:r>
+        <w:t>(https://www.canva.com/design/DAHXMBj4sf4/uyvdijfjtOq7j9AJvVlVkw/edit)</w:t>
+      </w:r>
+    </w:p>
     <w:tbl>
       <w:tblPr>
         <w:tblStyle w:val="LightGrid-Accent1"/>
@@ -1089,7 +1105,7 @@
                 <w:b/>
                 <w:sz w:val="18"/>
               </w:rPr>
-              <w:t>Enlace</w:t>
+              <w:t>Enlace / archivo</w:t>
             </w:r>
           </w:p>
         </w:tc>
@@ -1105,7 +1121,7 @@
                 <w:b/>
                 <w:sz w:val="18"/>
               </w:rPr>
-              <w:t>Infografía (PPTX para importar en Canva)</w:t>
+              <w:t>Infografía en Canva (enlace para compartir)</w:t>
             </w:r>
           </w:p>
         </w:tc>
@@ -1116,10 +1132,9 @@
           <w:p>
             <w:r>
               <w:rPr>
-                <w:rFonts w:ascii="Consolas" w:hAnsi="Consolas"/>
                 <w:sz w:val="18"/>
               </w:rPr>
-              <w:t>.../Docs/Evidencias/GA5-AA4-EV01_Infografia.pptx</w:t>
+              <w:t>https://canva.link/j1aecdvqxvhjluh</w:t>
             </w:r>
           </w:p>
         </w:tc>
@@ -1134,7 +1149,7 @@
               <w:rPr>
                 <w:sz w:val="18"/>
               </w:rPr>
-              <w:t>Infografía (PDF)</w:t>
+              <w:t>Infografía exportada (PDF)</w:t>
             </w:r>
           </w:p>
         </w:tc>
@@ -1148,7 +1163,36 @@
                 <w:rFonts w:ascii="Consolas" w:hAnsi="Consolas"/>
                 <w:sz w:val="18"/>
               </w:rPr>
-              <w:t>.../Docs/Evidencias/GA5-AA4-EV01_Infografia.pdf</w:t>
+              <w:t>SENA/NitroRythm/Entregas/GA5-AA4-EV01/GA5-AA4-EV01_Infografia_Canva.pdf</w:t>
+            </w:r>
+          </w:p>
+        </w:tc>
+      </w:tr>
+      <w:tr>
+        <w:tc>
+          <w:tcPr>
+            <w:tcW w:type="dxa" w:w="4320"/>
+          </w:tcPr>
+          <w:p>
+            <w:r>
+              <w:rPr>
+                <w:sz w:val="18"/>
+              </w:rPr>
+              <w:t>Documento editable en negro (DOCX)</w:t>
+            </w:r>
+          </w:p>
+        </w:tc>
+        <w:tc>
+          <w:tcPr>
+            <w:tcW w:type="dxa" w:w="4320"/>
+          </w:tcPr>
+          <w:p>
+            <w:r>
+              <w:rPr>
+                <w:rFonts w:ascii="Consolas" w:hAnsi="Consolas"/>
+                <w:sz w:val="18"/>
+              </w:rPr>
+              <w:t>.../Docs/Evidencias/GA5-AA4-EV01_Infografia_Comparativa.docx</w:t>
             </w:r>
           </w:p>
         </w:tc>

</xml_diff>